<commit_message>
feat: add support for appendices in letter generation
</commit_message>
<xml_diff>
--- a/Шаблон.docx
+++ b/Шаблон.docx
@@ -416,6 +416,11 @@
           <w:lang w:val="en-US"/>
         </w:rPr>
         <w:br/>
+      </w:r>
+    </w:p>
+    <w:p>
+      <w:r>
+        <w:t xml:space="preserve">{APPENDIX_LIST}</w:t>
       </w:r>
     </w:p>
     <w:p>

</xml_diff>